<commit_message>
Acrescenta comparacao do varejo ampliado e atualiza relatorios e dashboard
</commit_message>
<xml_diff>
--- a/docs/relatorios/RELATORIO_EXECUTIVO.docx
+++ b/docs/relatorios/RELATORIO_EXECUTIVO.docx
@@ -15,7 +15,7 @@
         <w:pStyle w:val="Subtitle"/>
       </w:pPr>
       <w:r>
-        <w:t>Potencial de mercado e expansão comercial • Referências para prospecção • 04/10/2026</w:t>
+        <w:t>Potencial de mercado e expansão comercial • Referências para prospecção • 05/10/2026</w:t>
       </w:r>
     </w:p>
     <w:p>
@@ -31,7 +31,7 @@
         <w:keepLines/>
       </w:pPr>
       <w:r>
-        <w:t>Começar a prospecção pelos polos Franca e Barretos, que concentram 68,55% dos estabelecimentos de varejo especializado analisados, e desenvolver em paralelo o circuito de Orlândia, Morro Agudo, Sales Oliveira e Nuporanga, cuja viagem exige a menor receita de equilíbrio simulada. Manter todas as cidades no plano e consolidar pedidos antes de mobilizar os circuitos mais distantes.</w:t>
+        <w:t>Começar a prospecção pelos polos Franca e Barretos, que concentram 68,55% do varejo especializado e 65,70% do ampliado, e desenvolver em paralelo o circuito de Orlândia, Morro Agudo, Sales Oliveira e Nuporanga, cuja viagem exige a menor receita de equilíbrio simulada. Manter todas as cidades no plano e consolidar pedidos antes de mobilizar os circuitos mais distantes.</w:t>
       </w:r>
     </w:p>
     <w:p>
@@ -47,7 +47,7 @@
         <w:keepLines/>
       </w:pPr>
       <w:r>
-        <w:t>São 12 municípios, 1.437 estabelecimentos de varejo especializado e 721.754 habitantes em 2024. Franca tem 690 estabelecimentos e Barretos, 295. Esses números indicam maior universo para prospecção, sem comprovar clientes disponíveis, volume de compra ou ausência de concorrentes. A qualidade do produto pode orientar a abordagem comercial e deve ser demonstrada ao comprador.</w:t>
+        <w:t>São 12 municípios e 721.754 habitantes em 2024. Franca tem 690 unidades especializadas e 1.189 no ampliado; Barretos tem 295 e 512, respectivamente. Esses números indicam maior universo para prospecção, sem comprovar clientes disponíveis, volume de compra ou ausência de concorrentes. A qualidade do produto pode orientar a abordagem comercial e deve ser demonstrada ao comprador.</w:t>
       </w:r>
     </w:p>
     <w:p>
@@ -55,7 +55,7 @@
         <w:keepLines/>
       </w:pPr>
       <w:r>
-        <w:t>O segmento medido é varejo especializado de alimentos, bebidas e fumo. Não inclui supermercados. Embora supermercados e redes sejam relevantes ao negócio, a base atual não permite medir seu tamanho, compras ou disponibilidade para novos fornecedores. A renda mediana de 2022 e a densidade de comércio ajudam a contextualizar os municípios, sem prever vendas.</w:t>
+        <w:t>São comparados dois recortes de 2024: varejo especializado de alimentos, bebidas e fumo (1.437 unidades) e varejo alimentar ampliado (2.589), que inclui o especializado, supermercados, hipermercados, minimercados e mercearias. As 1.152 unidades adicionais (+80,17%) refletem a ampliação das categorias, não crescimento temporal. A base não informa tamanho das redes, compras ou disponibilidade para novos fornecedores. Renda de 2022 e densidade contextualizam os mercados, sem prever vendas.</w:t>
       </w:r>
     </w:p>
     <w:p>
@@ -71,12 +71,21 @@
         <w:tblStyle w:val="LightShading-Accent1"/>
         <w:tblW w:type="auto" w:w="0"/>
         <w:tblLook w:firstColumn="1" w:firstRow="1" w:lastColumn="0" w:lastRow="0" w:noHBand="0" w:noVBand="1" w:val="04A0"/>
+        <w:tblBorders>
+          <w:top w:val="single" w:sz="4" w:color="D9D9D9"/>
+          <w:left w:val="single" w:sz="4" w:color="D9D9D9"/>
+          <w:bottom w:val="single" w:sz="4" w:color="D9D9D9"/>
+          <w:right w:val="single" w:sz="4" w:color="D9D9D9"/>
+          <w:insideH w:val="single" w:sz="4" w:color="D9D9D9"/>
+          <w:insideV w:val="single" w:sz="4" w:color="D9D9D9"/>
+        </w:tblBorders>
       </w:tblPr>
       <w:tblGrid>
-        <w:gridCol w:w="2556"/>
-        <w:gridCol w:w="2556"/>
-        <w:gridCol w:w="2556"/>
-        <w:gridCol w:w="2556"/>
+        <w:gridCol w:w="2045"/>
+        <w:gridCol w:w="2045"/>
+        <w:gridCol w:w="2045"/>
+        <w:gridCol w:w="2045"/>
+        <w:gridCol w:w="2045"/>
       </w:tblGrid>
       <w:tr>
         <w:trPr>
@@ -85,7 +94,7 @@
         </w:trPr>
         <w:tc>
           <w:tcPr>
-            <w:tcW w:type="dxa" w:w="2556"/>
+            <w:tcW w:type="dxa" w:w="2045"/>
           </w:tcPr>
           <w:p>
             <w:pPr>
@@ -101,7 +110,7 @@
         </w:tc>
         <w:tc>
           <w:tcPr>
-            <w:tcW w:type="dxa" w:w="2556"/>
+            <w:tcW w:type="dxa" w:w="2045"/>
           </w:tcPr>
           <w:p>
             <w:pPr>
@@ -111,13 +120,29 @@
               <w:rPr>
                 <w:sz w:val="18"/>
               </w:rPr>
-              <w:t>Varejo 2024</w:t>
+              <w:t>Especializado</w:t>
             </w:r>
           </w:p>
         </w:tc>
         <w:tc>
           <w:tcPr>
-            <w:tcW w:type="dxa" w:w="2556"/>
+            <w:tcW w:type="dxa" w:w="2045"/>
+          </w:tcPr>
+          <w:p>
+            <w:pPr>
+              <w:spacing w:after="60"/>
+            </w:pPr>
+            <w:r>
+              <w:rPr>
+                <w:sz w:val="18"/>
+              </w:rPr>
+              <w:t>Ampliado</w:t>
+            </w:r>
+          </w:p>
+        </w:tc>
+        <w:tc>
+          <w:tcPr>
+            <w:tcW w:type="dxa" w:w="2045"/>
           </w:tcPr>
           <w:p>
             <w:pPr>
@@ -133,7 +158,7 @@
         </w:tc>
         <w:tc>
           <w:tcPr>
-            <w:tcW w:type="dxa" w:w="2556"/>
+            <w:tcW w:type="dxa" w:w="2045"/>
           </w:tcPr>
           <w:p>
             <w:pPr>
@@ -143,7 +168,7 @@
               <w:rPr>
                 <w:sz w:val="18"/>
               </w:rPr>
-              <w:t>Receita de equilíbrio</w:t>
+              <w:t>Equilíbrio</w:t>
             </w:r>
           </w:p>
         </w:tc>
@@ -154,7 +179,7 @@
         </w:trPr>
         <w:tc>
           <w:tcPr>
-            <w:tcW w:type="dxa" w:w="2556"/>
+            <w:tcW w:type="dxa" w:w="2045"/>
           </w:tcPr>
           <w:p>
             <w:pPr>
@@ -170,7 +195,7 @@
         </w:tc>
         <w:tc>
           <w:tcPr>
-            <w:tcW w:type="dxa" w:w="2556"/>
+            <w:tcW w:type="dxa" w:w="2045"/>
           </w:tcPr>
           <w:p>
             <w:pPr>
@@ -186,7 +211,23 @@
         </w:tc>
         <w:tc>
           <w:tcPr>
-            <w:tcW w:type="dxa" w:w="2556"/>
+            <w:tcW w:type="dxa" w:w="2045"/>
+          </w:tcPr>
+          <w:p>
+            <w:pPr>
+              <w:spacing w:after="60"/>
+            </w:pPr>
+            <w:r>
+              <w:rPr>
+                <w:sz w:val="18"/>
+              </w:rPr>
+              <w:t>1.288</w:t>
+            </w:r>
+          </w:p>
+        </w:tc>
+        <w:tc>
+          <w:tcPr>
+            <w:tcW w:type="dxa" w:w="2045"/>
           </w:tcPr>
           <w:p>
             <w:pPr>
@@ -202,7 +243,7 @@
         </w:tc>
         <w:tc>
           <w:tcPr>
-            <w:tcW w:type="dxa" w:w="2556"/>
+            <w:tcW w:type="dxa" w:w="2045"/>
           </w:tcPr>
           <w:p>
             <w:pPr>
@@ -223,7 +264,7 @@
         </w:trPr>
         <w:tc>
           <w:tcPr>
-            <w:tcW w:type="dxa" w:w="2556"/>
+            <w:tcW w:type="dxa" w:w="2045"/>
           </w:tcPr>
           <w:p>
             <w:pPr>
@@ -239,7 +280,7 @@
         </w:tc>
         <w:tc>
           <w:tcPr>
-            <w:tcW w:type="dxa" w:w="2556"/>
+            <w:tcW w:type="dxa" w:w="2045"/>
           </w:tcPr>
           <w:p>
             <w:pPr>
@@ -255,7 +296,23 @@
         </w:tc>
         <w:tc>
           <w:tcPr>
-            <w:tcW w:type="dxa" w:w="2556"/>
+            <w:tcW w:type="dxa" w:w="2045"/>
+          </w:tcPr>
+          <w:p>
+            <w:pPr>
+              <w:spacing w:after="60"/>
+            </w:pPr>
+            <w:r>
+              <w:rPr>
+                <w:sz w:val="18"/>
+              </w:rPr>
+              <w:t>678</w:t>
+            </w:r>
+          </w:p>
+        </w:tc>
+        <w:tc>
+          <w:tcPr>
+            <w:tcW w:type="dxa" w:w="2045"/>
           </w:tcPr>
           <w:p>
             <w:pPr>
@@ -271,7 +328,7 @@
         </w:tc>
         <w:tc>
           <w:tcPr>
-            <w:tcW w:type="dxa" w:w="2556"/>
+            <w:tcW w:type="dxa" w:w="2045"/>
           </w:tcPr>
           <w:p>
             <w:pPr>
@@ -292,7 +349,7 @@
         </w:trPr>
         <w:tc>
           <w:tcPr>
-            <w:tcW w:type="dxa" w:w="2556"/>
+            <w:tcW w:type="dxa" w:w="2045"/>
           </w:tcPr>
           <w:p>
             <w:pPr>
@@ -308,7 +365,7 @@
         </w:tc>
         <w:tc>
           <w:tcPr>
-            <w:tcW w:type="dxa" w:w="2556"/>
+            <w:tcW w:type="dxa" w:w="2045"/>
           </w:tcPr>
           <w:p>
             <w:pPr>
@@ -324,7 +381,23 @@
         </w:tc>
         <w:tc>
           <w:tcPr>
-            <w:tcW w:type="dxa" w:w="2556"/>
+            <w:tcW w:type="dxa" w:w="2045"/>
+          </w:tcPr>
+          <w:p>
+            <w:pPr>
+              <w:spacing w:after="60"/>
+            </w:pPr>
+            <w:r>
+              <w:rPr>
+                <w:sz w:val="18"/>
+              </w:rPr>
+              <w:t>372</w:t>
+            </w:r>
+          </w:p>
+        </w:tc>
+        <w:tc>
+          <w:tcPr>
+            <w:tcW w:type="dxa" w:w="2045"/>
           </w:tcPr>
           <w:p>
             <w:pPr>
@@ -340,7 +413,7 @@
         </w:tc>
         <w:tc>
           <w:tcPr>
-            <w:tcW w:type="dxa" w:w="2556"/>
+            <w:tcW w:type="dxa" w:w="2045"/>
           </w:tcPr>
           <w:p>
             <w:pPr>
@@ -361,7 +434,7 @@
         </w:trPr>
         <w:tc>
           <w:tcPr>
-            <w:tcW w:type="dxa" w:w="2556"/>
+            <w:tcW w:type="dxa" w:w="2045"/>
           </w:tcPr>
           <w:p>
             <w:pPr>
@@ -377,7 +450,7 @@
         </w:tc>
         <w:tc>
           <w:tcPr>
-            <w:tcW w:type="dxa" w:w="2556"/>
+            <w:tcW w:type="dxa" w:w="2045"/>
           </w:tcPr>
           <w:p>
             <w:pPr>
@@ -393,7 +466,23 @@
         </w:tc>
         <w:tc>
           <w:tcPr>
-            <w:tcW w:type="dxa" w:w="2556"/>
+            <w:tcW w:type="dxa" w:w="2045"/>
+          </w:tcPr>
+          <w:p>
+            <w:pPr>
+              <w:spacing w:after="60"/>
+            </w:pPr>
+            <w:r>
+              <w:rPr>
+                <w:sz w:val="18"/>
+              </w:rPr>
+              <w:t>190</w:t>
+            </w:r>
+          </w:p>
+        </w:tc>
+        <w:tc>
+          <w:tcPr>
+            <w:tcW w:type="dxa" w:w="2045"/>
           </w:tcPr>
           <w:p>
             <w:pPr>
@@ -409,7 +498,7 @@
         </w:tc>
         <w:tc>
           <w:tcPr>
-            <w:tcW w:type="dxa" w:w="2556"/>
+            <w:tcW w:type="dxa" w:w="2045"/>
           </w:tcPr>
           <w:p>
             <w:pPr>
@@ -430,7 +519,7 @@
         </w:trPr>
         <w:tc>
           <w:tcPr>
-            <w:tcW w:type="dxa" w:w="2556"/>
+            <w:tcW w:type="dxa" w:w="2045"/>
           </w:tcPr>
           <w:p>
             <w:pPr>
@@ -446,7 +535,7 @@
         </w:tc>
         <w:tc>
           <w:tcPr>
-            <w:tcW w:type="dxa" w:w="2556"/>
+            <w:tcW w:type="dxa" w:w="2045"/>
           </w:tcPr>
           <w:p>
             <w:pPr>
@@ -462,7 +551,23 @@
         </w:tc>
         <w:tc>
           <w:tcPr>
-            <w:tcW w:type="dxa" w:w="2556"/>
+            <w:tcW w:type="dxa" w:w="2045"/>
+          </w:tcPr>
+          <w:p>
+            <w:pPr>
+              <w:spacing w:after="60"/>
+            </w:pPr>
+            <w:r>
+              <w:rPr>
+                <w:sz w:val="18"/>
+              </w:rPr>
+              <w:t>61</w:t>
+            </w:r>
+          </w:p>
+        </w:tc>
+        <w:tc>
+          <w:tcPr>
+            <w:tcW w:type="dxa" w:w="2045"/>
           </w:tcPr>
           <w:p>
             <w:pPr>
@@ -478,7 +583,7 @@
         </w:tc>
         <w:tc>
           <w:tcPr>
-            <w:tcW w:type="dxa" w:w="2556"/>
+            <w:tcW w:type="dxa" w:w="2045"/>
           </w:tcPr>
           <w:p>
             <w:pPr>
@@ -499,7 +604,7 @@
         <w:keepLines/>
       </w:pPr>
       <w:r>
-        <w:t>Todos os circuitos partem e retornam a Ribeirão Preto. As sequências são sugestões para orientar o vendedor; a programação de entregas e as rotas fixas permanecem sob responsabilidade do gerente do centro de distribuição. Os agrupamentos de Franca e Barretos somam 76,34% do varejo da seleção.</w:t>
+        <w:t>Todos os circuitos partem e retornam a Ribeirão Preto. As sequências são sugestões para orientar o vendedor; a programação de entregas e as rotas fixas permanecem sob responsabilidade do gerente do centro de distribuição. Os agrupamentos de Franca e Barretos somam 76,34% do especializado e 75,94% do ampliado. A ordem dos cinco circuitos permanece igual; custos e equilíbrio não mudam porque os trajetos e parâmetros foram mantidos.</w:t>
       </w:r>
     </w:p>
     <w:p>
@@ -547,7 +652,7 @@
         <w:keepLines/>
       </w:pPr>
       <w:r>
-        <w:t>2. Circuito próximo: trabalhar Orlândia e Morro Agudo com Sales Oliveira e Nuporanga. Esse agrupamento reúne 201 estabelecimentos e o menor equilíbrio de referência, R$ 933,58. É uma alternativa para desenvolver presença regional e ajustar o processo comercial.</w:t>
+        <w:t>2. Circuito próximo: trabalhar Orlândia e Morro Agudo com Sales Oliveira e Nuporanga. Esse agrupamento reúne 201 unidades especializadas e 372 no ampliado e o menor equilíbrio de referência, R$ 933,58. É uma alternativa para desenvolver presença regional e ajustar o processo comercial.</w:t>
       </w:r>
     </w:p>
     <w:p>
@@ -603,7 +708,7 @@
         <w:keepLines/>
       </w:pPr>
       <w:r>
-        <w:t>Entrega final: dashboard com filtros de circuito e cenário, perfil dos 12 municípios e referências de custo e receita de equilíbrio. Base de resultados: run_29 20261003T235010Z_0008bbdd. A finalidade é apoiar decisões de prospecção e formação de pedidos, com as limitações registradas.</w:t>
+        <w:t>Entrega final: dashboard com filtros de circuito e cenário, perfil dos 12 municípios e referências de custo e receita de equilíbrio. Base de resultados: run_29 20261003T235010Z_0008bbdd e run_32 20261005T143409Z_0c721611. A finalidade é apoiar decisões de prospecção e formação de pedidos, com as limitações registradas.</w:t>
       </w:r>
     </w:p>
     <w:sectPr>
@@ -1064,7 +1169,7 @@
       <w:rFonts w:asciiTheme="majorHAnsi" w:eastAsiaTheme="majorEastAsia" w:hAnsiTheme="majorHAnsi" w:cstheme="majorBidi"/>
       <w:b/>
       <w:bCs/>
-      <w:color w:val="17488B"/>
+      <w:color w:val="000000"/>
       <w:sz w:val="28"/>
       <w:szCs w:val="28"/>
     </w:rPr>
@@ -1088,7 +1193,7 @@
       <w:rFonts w:asciiTheme="majorHAnsi" w:eastAsiaTheme="majorEastAsia" w:hAnsiTheme="majorHAnsi" w:cstheme="majorBidi"/>
       <w:b/>
       <w:bCs/>
-      <w:color w:val="17488B"/>
+      <w:color w:val="000000"/>
       <w:sz w:val="28"/>
       <w:szCs w:val="26"/>
     </w:rPr>
@@ -1343,9 +1448,6 @@
     <w:qFormat/>
     <w:rsid w:val="00FC693F"/>
     <w:pPr>
-      <w:pBdr>
-        <w:bottom w:val="single" w:sz="8" w:space="4" w:color="4F81BD" w:themeColor="accent1"/>
-      </w:pBdr>
       <w:spacing w:after="300" w:line="240" w:lineRule="auto"/>
       <w:contextualSpacing/>
     </w:pPr>
@@ -1390,7 +1492,7 @@
       <w:rFonts w:asciiTheme="majorHAnsi" w:eastAsiaTheme="majorEastAsia" w:hAnsiTheme="majorHAnsi" w:cstheme="majorBidi"/>
       <w:i/>
       <w:iCs/>
-      <w:color w:val="4F81BD" w:themeColor="accent1"/>
+      <w:color w:val="000000"/>
       <w:spacing w:val="15"/>
       <w:sz w:val="24"/>
       <w:szCs w:val="24"/>

</xml_diff>